<commit_message>
Add WSGI entry point and update manual for PythonAnywhere deployment
Made-with: Cursor
</commit_message>
<xml_diff>
--- a/RabiesResQ_Installation_and_User_Guide.docx
+++ b/RabiesResQ_Installation_and_User_Guide.docx
@@ -52,7 +52,7 @@
         <w:spacing w:after="120"/>
       </w:pPr>
       <w:r>
-        <w:t>RabiesResQ is a browser-based application used to support rabies post-exposure workflows in a clinic setting. It lets patients manage appointments and view vaccination-related information, lets clinic personnel manage cases, appointments, availability, and vaccination records, and gives system administrators oversight of users, operational data, reporting, and settings. The software runs as a Python Flask server and stores data in SQLite.</w:t>
+        <w:t>RabiesResQ is a browser-based application used to support rabies post-exposure workflows in a clinic setting. It lets patients manage appointments and view vaccination-related information, lets clinic personnel manage cases, appointments, availability, and vaccination records, and gives system administrators oversight of users, operational data, reporting, and settings. The software runs as a Python Flask application behind a WSGI server and stores data in SQLite. This guide assumes production hosting on PythonAnywhere.</w:t>
       </w:r>
     </w:p>
     <w:p>
@@ -69,7 +69,7 @@
         <w:spacing w:after="60"/>
       </w:pPr>
       <w:r>
-        <w:t>A server or workstation capable of running Python 3 with the packages listed in requirements.txt.</w:t>
+        <w:t>Python 3 and the packages listed in requirements.txt (install inside a virtual environment on the host).</w:t>
       </w:r>
     </w:p>
     <w:p>
@@ -78,7 +78,7 @@
         <w:spacing w:after="60"/>
       </w:pPr>
       <w:r>
-        <w:t>Disk space for the SQLite database file and generated content.</w:t>
+        <w:t>A PythonAnywhere account for production deployment (paid plans add custom domains, scheduled tasks, and other options per PythonAnywhere documentation).</w:t>
       </w:r>
     </w:p>
     <w:p>
@@ -87,7 +87,16 @@
         <w:spacing w:after="60"/>
       </w:pPr>
       <w:r>
-        <w:t>Network access if the application is used from multiple devices; production deployments should use a proper WSGI server and HTTPS per IT policy.</w:t>
+        <w:t>Disk space for the SQLite database file and generated content on the host.</w:t>
+      </w:r>
+    </w:p>
+    <w:p>
+      <w:pPr>
+        <w:pStyle w:val="ListNumber"/>
+        <w:spacing w:after="60"/>
+      </w:pPr>
+      <w:r>
+        <w:t>Stable internet access for users; HTTPS is provided by PythonAnywhere for the default site URL and can be configured for custom domains on supported plans.</w:t>
       </w:r>
     </w:p>
     <w:p>
@@ -148,7 +157,7 @@
         <w:spacing w:after="60"/>
       </w:pPr>
       <w:r>
-        <w:t>For password reset email: configure SMTP (MAIL_USERNAME and MAIL_PASSWORD). If SMTP is not configured, email may be logged to the console in development.</w:t>
+        <w:t>For password reset email: configure SMTP (MAIL_USERNAME and MAIL_PASSWORD). The application uses Gmail SMTP on port 587 when those variables are set. On PythonAnywhere, confirm that your account tier allows outbound SMTP and follow PythonAnywhere’s email and security guidance; if SMTP is not configured, password reset emails will not be delivered.</w:t>
       </w:r>
     </w:p>
     <w:p>
@@ -165,7 +174,16 @@
         <w:spacing w:after="60"/>
       </w:pPr>
       <w:r>
-        <w:t>Open RabiesResQ using the URL from your administrator (for example http://localhost:5000 in development, or your HTTPS URL in production).</w:t>
+        <w:t>Production: open RabiesResQ at your PythonAnywhere URL (for example https://yourusername.pythonanywhere.com) or your custom domain if configured.</w:t>
+      </w:r>
+    </w:p>
+    <w:p>
+      <w:pPr>
+        <w:pStyle w:val="ListNumber"/>
+        <w:spacing w:after="60"/>
+      </w:pPr>
+      <w:r>
+        <w:t>Local testing: use http://127.0.0.1:5000 (or the host and port you choose) when running the development server.</w:t>
       </w:r>
     </w:p>
     <w:p>
@@ -182,7 +200,7 @@
         <w:pStyle w:val="Heading2"/>
       </w:pPr>
       <w:r>
-        <w:t>6. General steps for opening and using the system</w:t>
+        <w:t>6. Installation and deployment</w:t>
       </w:r>
     </w:p>
     <w:p>
@@ -199,7 +217,7 @@
         <w:spacing w:after="60"/>
       </w:pPr>
       <w:r>
-        <w:t>Install Python 3 and ensure pip is available.</w:t>
+        <w:t>On PythonAnywhere, open a Bash console. On a local machine, use a terminal with Python 3 and pip available.</w:t>
       </w:r>
     </w:p>
     <w:p>
@@ -208,7 +226,16 @@
         <w:spacing w:after="60"/>
       </w:pPr>
       <w:r>
-        <w:t>Create and activate a virtual environment (recommended).</w:t>
+        <w:t>Clone or upload the RabiesResQ project into a directory under your home folder (for example /home/yourusername/RABIESRESQ).</w:t>
+      </w:r>
+    </w:p>
+    <w:p>
+      <w:pPr>
+        <w:pStyle w:val="ListNumber"/>
+        <w:spacing w:after="60"/>
+      </w:pPr>
+      <w:r>
+        <w:t>Create a virtual environment and activate it. On PythonAnywhere, use the same Python version you will select for the web app.</w:t>
       </w:r>
     </w:p>
     <w:p>
@@ -234,7 +261,7 @@
         <w:spacing w:after="60"/>
       </w:pPr>
       <w:r>
-        <w:t>Create a .env file in the project directory.</w:t>
+        <w:t>Create a .env file in the project root (the folder that contains app.py). The application loads this file automatically.</w:t>
       </w:r>
     </w:p>
     <w:p>
@@ -252,7 +279,7 @@
         <w:spacing w:after="60"/>
       </w:pPr>
       <w:r>
-        <w:t>Optionally set DATABASE to the full path of your SQLite file; otherwise the app uses a default under the Flask instance folder.</w:t>
+        <w:t>Optionally set DATABASE to the full absolute path of your SQLite file; otherwise the app uses the default under the Flask instance folder (ensure this path is writable on PythonAnywhere).</w:t>
       </w:r>
     </w:p>
     <w:p>
@@ -261,7 +288,16 @@
         <w:spacing w:after="60"/>
       </w:pPr>
       <w:r>
-        <w:t>For outbound email, set MAIL_USERNAME and MAIL_PASSWORD (Gmail SMTP on port 587 when configured).</w:t>
+        <w:t>For outbound email, set MAIL_USERNAME and MAIL_PASSWORD when using Gmail SMTP as implemented in the application.</w:t>
+      </w:r>
+    </w:p>
+    <w:p>
+      <w:pPr>
+        <w:pStyle w:val="ListNumber"/>
+        <w:spacing w:after="60"/>
+      </w:pPr>
+      <w:r>
+        <w:t>Alternatively, you may define the same variables in the PythonAnywhere Web tab under Environment variables, if you prefer not to rely on a .env file on the server.</w:t>
       </w:r>
     </w:p>
     <w:p>
@@ -278,7 +314,7 @@
         <w:spacing w:after="60"/>
       </w:pPr>
       <w:r>
-        <w:t>Apply schema.sql to your SQLite database using your standard tooling.</w:t>
+        <w:t>Apply schema.sql to your SQLite database using the sqlite3 command line or another SQLite tool, targeting the same path the application will use (including under instance/ if you use the default).</w:t>
       </w:r>
     </w:p>
     <w:p>
@@ -303,7 +339,7 @@
         <w:spacing w:after="120"/>
       </w:pPr>
       <w:r>
-        <w:t>Use Flask CLI (flask --app app:create_app):</w:t>
+        <w:t>With the virtual environment activated, change to the project directory and run Flask CLI commands (flask --app app:create_app …). On PythonAnywhere, run these from a Bash console, not from the PythonAnywhere Python REPL.</w:t>
       </w:r>
     </w:p>
     <w:p>
@@ -338,7 +374,7 @@
         <w:spacing w:after="120"/>
       </w:pPr>
       <w:r>
-        <w:t>Additional staff may be created from the administrator user interface.</w:t>
+        <w:t>Additional staff may be created from the administrator user interface after deployment.</w:t>
       </w:r>
     </w:p>
     <w:p>
@@ -346,16 +382,15 @@
         <w:pStyle w:val="Heading3"/>
       </w:pPr>
       <w:r>
-        <w:t>6.5 Run the application</w:t>
+        <w:t>6.5 Production deployment on PythonAnywhere</w:t>
       </w:r>
     </w:p>
     <w:p>
       <w:pPr>
-        <w:pStyle w:val="ListNumber"/>
-        <w:spacing w:after="60"/>
+        <w:spacing w:after="120"/>
       </w:pPr>
       <w:r>
-        <w:t>Start the server, for example: flask --app app:create_app run</w:t>
+        <w:t>These steps follow the usual PythonAnywhere workflow for a Flask WSGI application. Exact labels may vary slightly as the PythonAnywhere dashboard is updated; use their documentation for the current Web configuration screens.</w:t>
       </w:r>
     </w:p>
     <w:p>
@@ -364,7 +399,7 @@
         <w:spacing w:after="60"/>
       </w:pPr>
       <w:r>
-        <w:t>Optionally specify host and port, e.g. --host 0.0.0.0 --port 5000</w:t>
+        <w:t>In the PythonAnywhere Dashboard, open the Web tab and create a web app if you have not already. Choose Manual configuration and select the Python version that matches your virtual environment.</w:t>
       </w:r>
     </w:p>
     <w:p>
@@ -373,15 +408,104 @@
         <w:spacing w:after="60"/>
       </w:pPr>
       <w:r>
-        <w:t>Open a browser to the server URL and sign in.</w:t>
+        <w:t>Set the virtual environment path on the Web tab to the virtualenv you created for RabiesResQ.</w:t>
       </w:r>
     </w:p>
     <w:p>
       <w:pPr>
+        <w:pStyle w:val="ListNumber"/>
+        <w:spacing w:after="60"/>
+      </w:pPr>
+      <w:r>
+        <w:t>Set the working directory (if the Web UI offers it) to your project folder, or rely on sys.path in the WSGI file as below.</w:t>
+      </w:r>
+    </w:p>
+    <w:p>
+      <w:pPr>
+        <w:pStyle w:val="ListNumber"/>
+        <w:spacing w:after="60"/>
+      </w:pPr>
+      <w:r>
+        <w:t>Edit the WSGI configuration file that PythonAnywhere provides for your site. Add your project directory to sys.path at the top of the file, then import the WSGI application object. For example, if the project lives at /home/yourusername/RABIESRESQ, add that path to sys.path, then use: from wsgi import application (the repository includes wsgi.py exposing application = create_app()).</w:t>
+      </w:r>
+    </w:p>
+    <w:p>
+      <w:pPr>
+        <w:pStyle w:val="ListNumber"/>
+        <w:spacing w:after="60"/>
+      </w:pPr>
+      <w:r>
+        <w:t>Ensure the WSGI file does not call app.run(); the web server invokes application directly.</w:t>
+      </w:r>
+    </w:p>
+    <w:p>
+      <w:pPr>
+        <w:pStyle w:val="ListNumber"/>
+        <w:spacing w:after="60"/>
+      </w:pPr>
+      <w:r>
+        <w:t>Optional: map the URL path /static/ to your project’s static/ folder in the Static files section of the Web tab so the web server can serve static assets efficiently.</w:t>
+      </w:r>
+    </w:p>
+    <w:p>
+      <w:pPr>
+        <w:pStyle w:val="ListNumber"/>
+        <w:spacing w:after="60"/>
+      </w:pPr>
+      <w:r>
+        <w:t>Click Reload to load configuration changes. Visit your site URL and confirm the login page loads.</w:t>
+      </w:r>
+    </w:p>
+    <w:p>
+      <w:pPr>
+        <w:pStyle w:val="ListNumber"/>
+        <w:spacing w:after="60"/>
+      </w:pPr>
+      <w:r>
+        <w:t>After each code update (for example git pull), reload the web app again so changes take effect.</w:t>
+      </w:r>
+    </w:p>
+    <w:p>
+      <w:pPr>
         <w:pStyle w:val="Heading3"/>
       </w:pPr>
       <w:r>
-        <w:t>6.6 Day-to-day use (all roles)</w:t>
+        <w:t>6.6 Local development (optional)</w:t>
+      </w:r>
+    </w:p>
+    <w:p>
+      <w:pPr>
+        <w:pStyle w:val="ListNumber"/>
+        <w:spacing w:after="60"/>
+      </w:pPr>
+      <w:r>
+        <w:t>For quick testing on your own computer, with .env and the database in place: flask --app app:create_app run</w:t>
+      </w:r>
+    </w:p>
+    <w:p>
+      <w:pPr>
+        <w:pStyle w:val="ListNumber"/>
+        <w:spacing w:after="60"/>
+      </w:pPr>
+      <w:r>
+        <w:t>Optionally bind to all interfaces: --host 0.0.0.0 --port 5000</w:t>
+      </w:r>
+    </w:p>
+    <w:p>
+      <w:pPr>
+        <w:pStyle w:val="ListNumber"/>
+        <w:spacing w:after="60"/>
+      </w:pPr>
+      <w:r>
+        <w:t>Do not use the Flask development server for production; use the PythonAnywhere WSGI deployment above for live hosting.</w:t>
+      </w:r>
+    </w:p>
+    <w:p>
+      <w:pPr>
+        <w:pStyle w:val="Heading3"/>
+      </w:pPr>
+      <w:r>
+        <w:t>6.7 Day-to-day use (all roles)</w:t>
       </w:r>
     </w:p>
     <w:p>

</xml_diff>

<commit_message>
Add profile and pre-screening UX fixes plus favicon updates
Improve patient/staff profile data handling, add password-change controls, tighten appointment slot past-time filtering, and refresh favicon/notification styling for more consistent UI behavior.

Made-with: Cursor
</commit_message>
<xml_diff>
--- a/RabiesResQ_Installation_and_User_Guide.docx
+++ b/RabiesResQ_Installation_and_User_Guide.docx
@@ -28,7 +28,7 @@
         <w:spacing w:after="120"/>
       </w:pPr>
       <w:r>
-        <w:t>This manual describes how to install and operate the RabiesResQ web application and how end users work with its features.</w:t>
+        <w:t>This manual describes how to access and use RabiesResQ, and includes technical notes for system administrators who host the application.</w:t>
       </w:r>
     </w:p>
     <w:p>
@@ -44,41 +44,48 @@
         <w:pStyle w:val="Heading2"/>
       </w:pPr>
       <w:r>
-        <w:t>1. Brief system overview</w:t>
+        <w:t>What You Need</w:t>
       </w:r>
     </w:p>
     <w:p>
       <w:pPr>
-        <w:spacing w:after="120"/>
+        <w:spacing w:after="60"/>
       </w:pPr>
       <w:r>
-        <w:t>RabiesResQ is a browser-based application used to support rabies post-exposure workflows in a clinic setting. It lets patients manage appointments and view vaccination-related information, lets clinic personnel manage cases, appointments, availability, and vaccination records, and gives system administrators oversight of users, operational data, reporting, and settings. The software runs as a Python Flask application behind a WSGI server and stores data in SQLite. This guide assumes production hosting on PythonAnywhere.</w:t>
+        <w:t xml:space="preserve">⚫ </w:t>
+      </w:r>
+      <w:r>
+        <w:t>A device (computer, laptop, tablet, or smartphone)</w:t>
       </w:r>
     </w:p>
     <w:p>
       <w:pPr>
-        <w:pStyle w:val="Heading2"/>
+        <w:spacing w:after="60"/>
       </w:pPr>
       <w:r>
-        <w:t>2. Basic system requirements</w:t>
+        <w:t xml:space="preserve">⚫ </w:t>
+      </w:r>
+      <w:r>
+        <w:t>Stable internet connection</w:t>
       </w:r>
     </w:p>
     <w:p>
       <w:pPr>
-        <w:pStyle w:val="ListNumber"/>
         <w:spacing w:after="60"/>
       </w:pPr>
       <w:r>
-        <w:t>Python 3 and the packages listed in requirements.txt (install inside a virtual environment on the host).</w:t>
+        <w:t xml:space="preserve">⚫ </w:t>
+      </w:r>
+      <w:r>
+        <w:t>A modern web browser (Chrome, Firefox, Edge, or Safari)</w:t>
       </w:r>
     </w:p>
     <w:p>
       <w:pPr>
-        <w:pStyle w:val="ListNumber"/>
-        <w:spacing w:after="60"/>
+        <w:pStyle w:val="Heading2"/>
       </w:pPr>
       <w:r>
-        <w:t>A PythonAnywhere account for production deployment (paid plans add custom domains, scheduled tasks, and other options per PythonAnywhere documentation).</w:t>
+        <w:t>How to Access</w:t>
       </w:r>
     </w:p>
     <w:p>
@@ -87,7 +94,7 @@
         <w:spacing w:after="60"/>
       </w:pPr>
       <w:r>
-        <w:t>Disk space for the SQLite database file and generated content on the host.</w:t>
+        <w:t>Open your web browser.</w:t>
       </w:r>
     </w:p>
     <w:p>
@@ -96,119 +103,48 @@
         <w:spacing w:after="60"/>
       </w:pPr>
       <w:r>
-        <w:t>Stable internet access for users; HTTPS is provided by PythonAnywhere for the default site URL and can be configured for custom domains on supported plans.</w:t>
+        <w:t>Go to: https://yourusername.pythonanywhere.com/ (replace yourusername with your PythonAnywhere username, or use the exact URL your organization provides if you have a custom domain).</w:t>
       </w:r>
     </w:p>
     <w:p>
       <w:pPr>
-        <w:pStyle w:val="Heading2"/>
+        <w:pStyle w:val="ListNumber"/>
+        <w:spacing w:after="60"/>
       </w:pPr>
       <w:r>
-        <w:t>3. Supported devices</w:t>
+        <w:t>The system will automatically load and adjust to your screen size.</w:t>
       </w:r>
     </w:p>
     <w:p>
       <w:pPr>
-        <w:pStyle w:val="ListNumber"/>
-        <w:spacing w:after="60"/>
+        <w:spacing w:after="120"/>
       </w:pPr>
       <w:r>
-        <w:t>Desktop and laptop computers with a modern web browser (primary intended use).</w:t>
+        <w:t>If you do not know the correct address, ask your clinic or system administrator.</w:t>
       </w:r>
     </w:p>
     <w:p>
       <w:pPr>
-        <w:pStyle w:val="ListNumber"/>
-        <w:spacing w:after="60"/>
+        <w:pStyle w:val="Heading2"/>
       </w:pPr>
       <w:r>
-        <w:t>Tablets and smartphones may be used where the responsive layout fits your workflow.</w:t>
+        <w:t>For system administrators: hosting and deployment</w:t>
       </w:r>
     </w:p>
     <w:p>
       <w:pPr>
-        <w:pStyle w:val="Heading2"/>
+        <w:spacing w:after="120"/>
       </w:pPr>
       <w:r>
-        <w:t>4. Internet and browser requirements</w:t>
+        <w:t>RabiesResQ is a browser-based application for rabies post-exposure workflows: patients, clinic personnel, and system administrators use roles to access cases, appointments, vaccination records, and reporting. The application is built with Python Flask, served via WSGI, and uses SQLite. The following steps describe deployment on PythonAnywhere.</w:t>
       </w:r>
     </w:p>
     <w:p>
       <w:pPr>
-        <w:pStyle w:val="ListNumber"/>
-        <w:spacing w:after="60"/>
+        <w:pStyle w:val="Heading3"/>
       </w:pPr>
       <w:r>
-        <w:t>Internet access is required when users reach the application over the internet or when email-based password recovery is used.</w:t>
-      </w:r>
-    </w:p>
-    <w:p>
-      <w:pPr>
-        <w:pStyle w:val="ListNumber"/>
-        <w:spacing w:after="60"/>
-      </w:pPr>
-      <w:r>
-        <w:t>Use a current version of a major browser (Chrome, Edge, Firefox, or Safari). JavaScript should be enabled.</w:t>
-      </w:r>
-    </w:p>
-    <w:p>
-      <w:pPr>
-        <w:pStyle w:val="ListNumber"/>
-        <w:spacing w:after="60"/>
-      </w:pPr>
-      <w:r>
-        <w:t>For password reset email: configure SMTP (MAIL_USERNAME and MAIL_PASSWORD). The application uses Gmail SMTP on port 587 when those variables are set. On PythonAnywhere, confirm that your account tier allows outbound SMTP and follow PythonAnywhere’s email and security guidance; if SMTP is not configured, password reset emails will not be delivered.</w:t>
-      </w:r>
-    </w:p>
-    <w:p>
-      <w:pPr>
-        <w:pStyle w:val="Heading2"/>
-      </w:pPr>
-      <w:r>
-        <w:t>5. How to access the system</w:t>
-      </w:r>
-    </w:p>
-    <w:p>
-      <w:pPr>
-        <w:pStyle w:val="ListNumber"/>
-        <w:spacing w:after="60"/>
-      </w:pPr>
-      <w:r>
-        <w:t>Production: open RabiesResQ at your PythonAnywhere URL (for example https://yourusername.pythonanywhere.com) or your custom domain if configured.</w:t>
-      </w:r>
-    </w:p>
-    <w:p>
-      <w:pPr>
-        <w:pStyle w:val="ListNumber"/>
-        <w:spacing w:after="60"/>
-      </w:pPr>
-      <w:r>
-        <w:t>Local testing: use http://127.0.0.1:5000 (or the host and port you choose) when running the development server.</w:t>
-      </w:r>
-    </w:p>
-    <w:p>
-      <w:pPr>
-        <w:pStyle w:val="ListNumber"/>
-        <w:spacing w:after="60"/>
-      </w:pPr>
-      <w:r>
-        <w:t>Unauthenticated visitors are directed to the login page. After authentication, users are routed by role (patient, clinic personnel, system administrator).</w:t>
-      </w:r>
-    </w:p>
-    <w:p>
-      <w:pPr>
-        <w:pStyle w:val="Heading2"/>
-      </w:pPr>
-      <w:r>
-        <w:t>6. Installation and deployment</w:t>
-      </w:r>
-    </w:p>
-    <w:p>
-      <w:pPr>
-        <w:pStyle w:val="Heading3"/>
-      </w:pPr>
-      <w:r>
-        <w:t>6.1 Prepare the environment</w:t>
+        <w:t>1. Prepare the environment</w:t>
       </w:r>
     </w:p>
     <w:p>
@@ -252,7 +188,7 @@
         <w:pStyle w:val="Heading3"/>
       </w:pPr>
       <w:r>
-        <w:t>6.2 Configure environment variables</w:t>
+        <w:t>2. Configure environment variables</w:t>
       </w:r>
     </w:p>
     <w:p>
@@ -305,7 +241,7 @@
         <w:pStyle w:val="Heading3"/>
       </w:pPr>
       <w:r>
-        <w:t>6.3 Initialize the database</w:t>
+        <w:t>3. Initialize the database</w:t>
       </w:r>
     </w:p>
     <w:p>
@@ -331,7 +267,7 @@
         <w:pStyle w:val="Heading3"/>
       </w:pPr>
       <w:r>
-        <w:t>6.4 Create initial clinic and privileged accounts</w:t>
+        <w:t>4. Create initial clinic and privileged accounts</w:t>
       </w:r>
     </w:p>
     <w:p>
@@ -382,7 +318,7 @@
         <w:pStyle w:val="Heading3"/>
       </w:pPr>
       <w:r>
-        <w:t>6.5 Production deployment on PythonAnywhere</w:t>
+        <w:t>5. Production deployment on PythonAnywhere</w:t>
       </w:r>
     </w:p>
     <w:p>
@@ -470,7 +406,7 @@
         <w:pStyle w:val="Heading3"/>
       </w:pPr>
       <w:r>
-        <w:t>6.6 Local development (optional)</w:t>
+        <w:t>6. Local development (optional)</w:t>
       </w:r>
     </w:p>
     <w:p>
@@ -502,37 +438,10 @@
     </w:p>
     <w:p>
       <w:pPr>
-        <w:pStyle w:val="Heading3"/>
+        <w:spacing w:after="120"/>
       </w:pPr>
       <w:r>
-        <w:t>6.7 Day-to-day use (all roles)</w:t>
-      </w:r>
-    </w:p>
-    <w:p>
-      <w:pPr>
-        <w:pStyle w:val="ListNumber"/>
-        <w:spacing w:after="60"/>
-      </w:pPr>
-      <w:r>
-        <w:t>Sign in with email and password.</w:t>
-      </w:r>
-    </w:p>
-    <w:p>
-      <w:pPr>
-        <w:pStyle w:val="ListNumber"/>
-        <w:spacing w:after="60"/>
-      </w:pPr>
-      <w:r>
-        <w:t>Use the sidebar or main navigation for your role.</w:t>
-      </w:r>
-    </w:p>
-    <w:p>
-      <w:pPr>
-        <w:pStyle w:val="ListNumber"/>
-        <w:spacing w:after="60"/>
-      </w:pPr>
-      <w:r>
-        <w:t>Sign out when finished, especially on shared workstations.</w:t>
+        <w:t>Email for password reset requires SMTP configuration (MAIL_USERNAME and MAIL_PASSWORD). On PythonAnywhere, confirm your account tier allows outbound SMTP; if email is not configured, reset codes will not be delivered to users.</w:t>
       </w:r>
     </w:p>
     <w:p>

</xml_diff>